<commit_message>
ТВО ПЗ1: make ЗВІТ Heading 1, sections Heading 2, subsections Heading 3
Also shrink embedded images to grayscale so the document is ~50 KB.

Co-Authored-By: Claude Opus 5.5 <noreply@anthropic.com>
Claude-Session: https://claude.ai/code/session_01RzjZ6SvYQVfJPgJgMtqEEC
</commit_message>
<xml_diff>
--- a/tvo/pz1/КНТ-23-1_Кравченко_ПЗ1.docx
+++ b/tvo/pz1/КНТ-23-1_Кравченко_ПЗ1.docx
@@ -81,16 +81,11 @@
     </w:p>
     <w:p>
       <w:pPr>
-        <w:spacing w:line="360" w:lineRule="auto"/>
-        <w:jc w:val="center"/>
-      </w:pPr>
-      <w:r>
-        <w:rPr>
-          <w:rFonts w:ascii="Times New Roman" w:cs="Times New Roman" w:eastAsia="Times New Roman" w:hAnsi="Times New Roman"/>
-          <w:b/>
-          <w:bCs/>
-          <w:sz w:val="32"/>
-          <w:szCs w:val="32"/>
+        <w:pStyle w:val="Heading1"/>
+      </w:pPr>
+      <w:r>
+        <w:rPr>
+          <w:rFonts w:ascii="Times New Roman" w:cs="Times New Roman" w:eastAsia="Times New Roman" w:hAnsi="Times New Roman"/>
         </w:rPr>
         <w:t xml:space="preserve">ЗВІТ</w:t>
       </w:r>
@@ -325,7 +320,7 @@
     </w:p>
     <w:p>
       <w:pPr>
-        <w:pStyle w:val="Heading1"/>
+        <w:pStyle w:val="Heading2"/>
         <w:pageBreakBefore/>
       </w:pPr>
       <w:r>
@@ -350,7 +345,7 @@
     </w:p>
     <w:p>
       <w:pPr>
-        <w:pStyle w:val="Heading1"/>
+        <w:pStyle w:val="Heading2"/>
       </w:pPr>
       <w:r>
         <w:rPr>
@@ -601,7 +596,7 @@
     </w:p>
     <w:p>
       <w:pPr>
-        <w:pStyle w:val="Heading1"/>
+        <w:pStyle w:val="Heading2"/>
       </w:pPr>
       <w:r>
         <w:rPr>
@@ -612,7 +607,7 @@
     </w:p>
     <w:p>
       <w:pPr>
-        <w:pStyle w:val="Heading2"/>
+        <w:pStyle w:val="Heading3"/>
       </w:pPr>
       <w:r>
         <w:rPr>
@@ -2977,7 +2972,7 @@
     </w:tbl>
     <w:p>
       <w:pPr>
-        <w:pStyle w:val="Heading2"/>
+        <w:pStyle w:val="Heading3"/>
       </w:pPr>
       <w:r>
         <w:rPr>
@@ -3060,7 +3055,7 @@
     </w:p>
     <w:p>
       <w:pPr>
-        <w:pStyle w:val="Heading2"/>
+        <w:pStyle w:val="Heading3"/>
       </w:pPr>
       <w:r>
         <w:rPr>
@@ -3179,7 +3174,7 @@
     </w:p>
     <w:p>
       <w:pPr>
-        <w:pStyle w:val="Heading2"/>
+        <w:pStyle w:val="Heading3"/>
       </w:pPr>
       <w:r>
         <w:rPr>
@@ -4610,7 +4605,7 @@
     </w:p>
     <w:p>
       <w:pPr>
-        <w:pStyle w:val="Heading2"/>
+        <w:pStyle w:val="Heading3"/>
       </w:pPr>
       <w:r>
         <w:rPr>
@@ -4808,7 +4803,7 @@
     </w:p>
     <w:p>
       <w:pPr>
-        <w:pStyle w:val="Heading2"/>
+        <w:pStyle w:val="Heading3"/>
       </w:pPr>
       <w:r>
         <w:rPr>
@@ -5891,7 +5886,7 @@
     </w:p>
     <w:p>
       <w:pPr>
-        <w:pStyle w:val="Heading2"/>
+        <w:pStyle w:val="Heading3"/>
       </w:pPr>
       <w:r>
         <w:rPr>
@@ -7069,7 +7064,7 @@
     </w:p>
     <w:p>
       <w:pPr>
-        <w:pStyle w:val="Heading2"/>
+        <w:pStyle w:val="Heading3"/>
       </w:pPr>
       <w:r>
         <w:rPr>
@@ -8340,7 +8335,7 @@
     </w:tbl>
     <w:p>
       <w:pPr>
-        <w:pStyle w:val="Heading1"/>
+        <w:pStyle w:val="Heading2"/>
       </w:pPr>
       <w:r>
         <w:rPr>
@@ -9063,9 +9058,29 @@
     <w:qFormat/>
     <w:pPr>
       <w:keepNext/>
+      <w:spacing w:after="0" w:before="0" w:line="360" w:lineRule="auto"/>
+      <w:jc w:val="center"/>
+      <w:outlineLvl w:val="0"/>
+    </w:pPr>
+    <w:rPr>
+      <w:rFonts w:ascii="Times New Roman" w:cs="Times New Roman" w:eastAsia="Times New Roman" w:hAnsi="Times New Roman"/>
+      <w:b/>
+      <w:bCs/>
+      <w:color w:val="000000"/>
+      <w:sz w:val="32"/>
+      <w:szCs w:val="32"/>
+    </w:rPr>
+  </w:style>
+  <w:style w:type="paragraph" w:styleId="Heading2">
+    <w:name w:val="Heading 2"/>
+    <w:basedOn w:val="Normal"/>
+    <w:next w:val="Normal"/>
+    <w:qFormat/>
+    <w:pPr>
+      <w:keepNext/>
       <w:spacing w:after="240" w:before="240" w:line="360" w:lineRule="auto"/>
       <w:jc w:val="center"/>
-      <w:outlineLvl w:val="0"/>
+      <w:outlineLvl w:val="1"/>
     </w:pPr>
     <w:rPr>
       <w:rFonts w:ascii="Times New Roman" w:cs="Times New Roman" w:eastAsia="Times New Roman" w:hAnsi="Times New Roman"/>
@@ -9077,8 +9092,8 @@
       <w:szCs w:val="28"/>
     </w:rPr>
   </w:style>
-  <w:style w:type="paragraph" w:styleId="Heading2">
-    <w:name w:val="Heading 2"/>
+  <w:style w:type="paragraph" w:styleId="Heading3">
+    <w:name w:val="Heading 3"/>
     <w:basedOn w:val="Normal"/>
     <w:next w:val="Normal"/>
     <w:qFormat/>
@@ -9086,7 +9101,7 @@
       <w:keepNext/>
       <w:spacing w:after="120" w:before="240" w:line="360" w:lineRule="auto"/>
       <w:ind w:firstLine="709"/>
-      <w:outlineLvl w:val="1"/>
+      <w:outlineLvl w:val="2"/>
     </w:pPr>
     <w:rPr>
       <w:rFonts w:ascii="Times New Roman" w:cs="Times New Roman" w:eastAsia="Times New Roman" w:hAnsi="Times New Roman"/>

</xml_diff>